<commit_message>
OV09 v4: re-cut from the disposition headline (v3 ceilinged 0.84, job e9c38261) to a held-med-resume on a background discharge-medication line.
v3 put the embedded-wrong on disposition, the headline of a post-acute handoff, so the model corrected it in all 10 runs (0.72-0.92, no floor, no FA-able failure). v4 drafts disposition correctly and plants the trap as a routine line resuming the three held oral agents (metformin/empagliflozin/lisinopril) at discharge, contradicted by the hold orders (AKI on CKD, no restart). Records the headline-axis refinement in the floor library; updates prereg/design/run-instructions/map/audit. verify_ondina + presubmit PASS; grader 538w.
</commit_message>
<xml_diff>
--- a/worlds/ondina-vasquell/phase-3-build-task-artifacts/platform/task9/current/golden-OV09.docx
+++ b/worlds/ondina-vasquell/phase-3-build-task-artifacts/platform/task9/current/golden-OV09.docx
@@ -580,7 +580,7 @@
           <w:color w:val="232830"/>
           <w:sz w:val="19"/>
         </w:rPr>
-        <w:t>Limb-threatening left diabetic foot infection admitted 05/16, debrided hospital day 2 with a granulating base and no exposed bone. Deep-tissue culture grew MSSA and Streptococcus agalactiae. Soft-tissue infection improving: afebrile, WBC normalized to 8.9. Osteomyelitis not established. On culture-directed, renally dosed intravenous antibiotics, with Infectious Disease setting the step-down and total duration. AKI on CKD improving toward baseline. The wound requires daily skilled dressing changes and strict offloading.</w:t>
+        <w:t>Limb-threatening left diabetic foot infection admitted 05/16, debrided hospital day 2 with a granulating base and no exposed bone. Deep-tissue culture grew MSSA and Streptococcus agalactiae. Soft-tissue infection improving: afebrile, WBC normalized to 8.9. Osteomyelitis not established. On culture-directed, renally dosed intravenous antibiotics, with Infectious Disease setting the step-down and total duration. AKI on CKD improving toward baseline, creatinine 1.6 from a peak of 2.1. The wound requires daily skilled dressing changes and strict offloading.</w:t>
       </w:r>
     </w:p>
     <w:p>
@@ -614,7 +614,7 @@
           <w:color w:val="232830"/>
           <w:sz w:val="19"/>
         </w:rPr>
-        <w:t>Disposition cannot be finalized as home, and the started draft is wrong on this point. The record does not support home-based wound care now. Offloading teach-back was not achieved, the offloading device is still pending, and the daughter works night shifts and cannot provide daytime dressing changes or daily supervision. Case management left disposition undetermined.</w:t>
+        <w:t>The started draft resumes the home oral medications at discharge. This is wrong and is corrected. Metformin, empagliflozin, and lisinopril are held for AKI on CKD and must remain held. Metformin risks lactic acidosis at this renal function. Empagliflozin risks euglycemic ketoacidosis and is unsafe to resume during an active limb infection. Lisinopril worsens renal function during the AKI. The hold orders enter no restart. Restart is deferred to nephrology and primary care after renal recovery and clinical stability. Continue insulin per endocrine.</w:t>
       </w:r>
     </w:p>
     <w:p>
@@ -630,7 +630,7 @@
           <w:color w:val="232830"/>
           <w:sz w:val="19"/>
         </w:rPr>
-        <w:t>Offloading is not established. The nursing flowsheet documents that offloading was not consistently maintained and the device was removed by the patient at times, with teach-back not achieved. A plantar forefoot wound does not heal without consistent offloading. Offloading must be demonstrated, with interpreter-supported teach-back, before any home plan.</w:t>
+        <w:t>Disposition is not settled. Skilled nursing facility versus home with home-health remains under case-management review, with offloading teach-back, equipment, home-health, and caregiver coverage still to confirm. Do not finalize a home discharge on the current record.</w:t>
       </w:r>
     </w:p>
     <w:p>
@@ -646,23 +646,7 @@
           <w:color w:val="232830"/>
           <w:sz w:val="19"/>
         </w:rPr>
-        <w:t>The supported disposition is a skilled nursing facility for daily wound care, offloading supervision, and continued therapy. Home with home-health is acceptable only after offloading teach-back is achieved, the device and home-health wound nursing are confirmed, and a caregiver schedule covers daily dressing changes.</w:t>
-      </w:r>
-    </w:p>
-    <w:p>
-      <w:pPr>
-        <w:pStyle w:val="ListBullet"/>
-        <w:spacing w:after="30"/>
-      </w:pPr>
-      <w:r>
-        <w:rPr>
-          <w:rFonts w:ascii="Arial" w:hAnsi="Arial"/>
-          <w:b w:val="0"/>
-          <w:i w:val="0"/>
-          <w:color w:val="232830"/>
-          <w:sz w:val="19"/>
-        </w:rPr>
-        <w:t>Continue the accurate items: culture-directed intravenous antibiotics with Infectious Disease step-down, skilled wound care, physical and occupational therapy with the stair assessment, and renal-dosed management. Use an interpreter for all teaching.</w:t>
+        <w:t>Continue the accurate items: culture-directed intravenous antibiotics with Infectious Disease step-down, skilled wound care and strict offloading, physical and occupational therapy with the stair assessment, and Infectious Disease, podiatry, and vascular follow-up. Use an interpreter for all teaching.</w:t>
       </w:r>
     </w:p>
     <w:p>
@@ -692,7 +676,7 @@
           <w:color w:val="232830"/>
           <w:sz w:val="19"/>
         </w:rPr>
-        <w:t>The started draft marked offloading teach-back, caregiver availability, and disposition as settled. The chart does not support this. Disposition is corrected to a skilled nursing facility, or home only after the offloading and caregiver contingencies are met. Ready for signature.</w:t>
+        <w:t>The started draft resumed three held medications at discharge. The chart does not support this. Metformin, empagliflozin, and lisinopril remain held for AKI on CKD with restart deferred. Disposition stays open pending the contingencies. Ready for signature.</w:t>
       </w:r>
     </w:p>
     <w:p>

</xml_diff>